<commit_message>
Support single-document preparation and restore Digis role stacks
</commit_message>
<xml_diff>
--- a/registry/jobs/2026-08-07_140606_digis-a-fiverr-company-nyse-fvrr_senior-laravel-developer/application/CV_ValentinNikolaev_digisafiverrcompanynysefvrr_SeniorLaravelDeveloper.docx
+++ b/registry/jobs/2026-08-07_140606_digis-a-fiverr-company-nyse-fvrr_senior-laravel-developer/application/CV_ValentinNikolaev_digisafiverrcompanynysefvrr_SeniorLaravelDeveloper.docx
@@ -76,7 +76,7 @@
         </w:rPr>
         <w:t xml:space="preserve">+39 351 370 1194 | </w:t>
       </w:r>
-      <w:hyperlink w:history="1" r:id="rIdwukb67c89nzraug4zb-0f">
+      <w:hyperlink w:history="1" r:id="rIdhysbkqmgefqqrxigcbkko">
         <w:r>
           <w:rPr>
             <w:rFonts w:ascii="Aptos" w:cs="Aptos" w:eastAsia="Aptos" w:hAnsi="Aptos"/>
@@ -100,7 +100,7 @@
         <w:t xml:space="preserve">
 </w:t>
       </w:r>
-      <w:hyperlink w:history="1" r:id="rIdwtjz3tjxdzmu9ptf25e3x">
+      <w:hyperlink w:history="1" r:id="rIdyf5bc4g5xpxomeg78fqsb">
         <w:r>
           <w:rPr>
             <w:rFonts w:ascii="Aptos" w:cs="Aptos" w:eastAsia="Aptos" w:hAnsi="Aptos"/>
@@ -123,7 +123,7 @@
         </w:rPr>
         <w:t xml:space="preserve"> | </w:t>
       </w:r>
-      <w:hyperlink w:history="1" r:id="rIdu7zsekgdvkurlfldc_3hg">
+      <w:hyperlink w:history="1" r:id="rId8tznpz52cjnpf2fg3ufap">
         <w:r>
           <w:rPr>
             <w:rFonts w:ascii="Aptos" w:cs="Aptos" w:eastAsia="Aptos" w:hAnsi="Aptos"/>
@@ -335,6 +335,23 @@
     </w:p>
     <w:p>
       <w:pPr>
+        <w:bidi w:val="false"/>
+        <w:spacing w:after="120" w:before="120" w:line="259.20000000000005"/>
+        <w:jc w:val="left"/>
+      </w:pPr>
+      <w:r>
+        <w:rPr>
+          <w:rFonts w:ascii="Aptos" w:cs="Aptos" w:eastAsia="Aptos" w:hAnsi="Aptos"/>
+          <w:color w:val="000000"/>
+          <w:sz w:val="24"/>
+          <w:szCs w:val="24"/>
+          <w:rtl w:val="false"/>
+        </w:rPr>
+        <w:t xml:space="preserve">Technologies: Go | REST APIs | Backend Integrations | Zendesk | Intercom | Monitoring | System Design</w:t>
+      </w:r>
+    </w:p>
+    <w:p>
+      <w:pPr>
         <w:pStyle w:val="3"/>
         <w:pStyle w:val="Heading3"/>
         <w:bidi w:val="false"/>
@@ -437,6 +454,23 @@
     </w:p>
     <w:p>
       <w:pPr>
+        <w:bidi w:val="false"/>
+        <w:spacing w:after="120" w:before="120" w:line="259.20000000000005"/>
+        <w:jc w:val="left"/>
+      </w:pPr>
+      <w:r>
+        <w:rPr>
+          <w:rFonts w:ascii="Aptos" w:cs="Aptos" w:eastAsia="Aptos" w:hAnsi="Aptos"/>
+          <w:color w:val="000000"/>
+          <w:sz w:val="24"/>
+          <w:szCs w:val="24"/>
+          <w:rtl w:val="false"/>
+        </w:rPr>
+        <w:t xml:space="preserve">Technologies: PHP | AWS EventBridge | Queues | Webhooks | Amazon S3 | Event-Driven Systems | Observability</w:t>
+      </w:r>
+    </w:p>
+    <w:p>
+      <w:pPr>
         <w:pStyle w:val="3"/>
         <w:pStyle w:val="Heading3"/>
         <w:bidi w:val="false"/>
@@ -560,6 +594,23 @@
     </w:p>
     <w:p>
       <w:pPr>
+        <w:bidi w:val="false"/>
+        <w:spacing w:after="120" w:before="120" w:line="259.20000000000005"/>
+        <w:jc w:val="left"/>
+      </w:pPr>
+      <w:r>
+        <w:rPr>
+          <w:rFonts w:ascii="Aptos" w:cs="Aptos" w:eastAsia="Aptos" w:hAnsi="Aptos"/>
+          <w:color w:val="000000"/>
+          <w:sz w:val="24"/>
+          <w:szCs w:val="24"/>
+          <w:rtl w:val="false"/>
+        </w:rPr>
+        <w:t xml:space="preserve">Technologies: PHP | Laravel | Symfony | MySQL | Elasticsearch | RabbitMQ | REST APIs | AWS | Kubernetes | Prometheus | Helm | GitHub Actions | ArgoCD</w:t>
+      </w:r>
+    </w:p>
+    <w:p>
+      <w:pPr>
         <w:pStyle w:val="3"/>
         <w:pStyle w:val="Heading3"/>
         <w:bidi w:val="false"/>
@@ -662,6 +713,23 @@
     </w:p>
     <w:p>
       <w:pPr>
+        <w:bidi w:val="false"/>
+        <w:spacing w:after="120" w:before="120" w:line="259.20000000000005"/>
+        <w:jc w:val="left"/>
+      </w:pPr>
+      <w:r>
+        <w:rPr>
+          <w:rFonts w:ascii="Aptos" w:cs="Aptos" w:eastAsia="Aptos" w:hAnsi="Aptos"/>
+          <w:color w:val="000000"/>
+          <w:sz w:val="24"/>
+          <w:szCs w:val="24"/>
+          <w:rtl w:val="false"/>
+        </w:rPr>
+        <w:t xml:space="preserve">Technologies: PHP | Laravel | Go | MySQL | PostgreSQL | AWS | Kubernetes | Microservices | REST APIs | CI/CD</w:t>
+      </w:r>
+    </w:p>
+    <w:p>
+      <w:pPr>
         <w:pStyle w:val="3"/>
         <w:pStyle w:val="Heading3"/>
         <w:bidi w:val="false"/>
@@ -760,6 +828,23 @@
           <w:rtl w:val="false"/>
         </w:rPr>
         <w:t xml:space="preserve">Made key technical decisions across service design, delivery reliability, and email infrastructure, including DNS, DKIM, SPF, DMARC, and feedback loops.</w:t>
+      </w:r>
+    </w:p>
+    <w:p>
+      <w:pPr>
+        <w:bidi w:val="false"/>
+        <w:spacing w:after="120" w:before="120" w:line="259.20000000000005"/>
+        <w:jc w:val="left"/>
+      </w:pPr>
+      <w:r>
+        <w:rPr>
+          <w:rFonts w:ascii="Aptos" w:cs="Aptos" w:eastAsia="Aptos" w:hAnsi="Aptos"/>
+          <w:color w:val="000000"/>
+          <w:sz w:val="24"/>
+          <w:szCs w:val="24"/>
+          <w:rtl w:val="false"/>
+        </w:rPr>
+        <w:t xml:space="preserve">Technologies: PHP | Laravel | MySQL | Elasticsearch | RabbitMQ | AWS | REST APIs | Email Infrastructure | DNS | DKIM | SPF | DMARC</w:t>
       </w:r>
     </w:p>
     <w:p>

</xml_diff>